<commit_message>
docs(examples): demonstrate fallback-supported run/paragraph OOXML children
The generic typed-attribute fallback already round-trips (add/set/get) many
OOXML children that have no curated handler case. They were absent from the
showcases. Add them so the trio is as complete as possible.

- run: em (着重号 dot/underDot/circle), effect, webHidden, fitText
- paragraph: pBdr box borders, textAlignment, EastAsian typography toggles
  (kinsoku/autoSpaceDE/DN/overflowPunct/topLinePunct), and line/indent flags
  (suppressLineNumbers/suppressAutoHyphens/mirrorIndents/adjustRightInd/snapToGrid)
- use whole-box border form only (per-side border.top warns unsupported)
- regenerate both .docx; validate clean; em marks and pBdr boxes confirmed
  rendering in real Word
</commit_message>
<xml_diff>
--- a/examples/word/paragraph-showcase.docx
+++ b/examples/word/paragraph-showcase.docx
@@ -610,6 +610,156 @@
       <w:r>
         <w:rPr/>
         <w:t xml:space="preserve">Framed paragraph — floats in a 3-inch box with text wrapping around it, anchored to the margin.</w:t>
+      </w:r>
+    </w:p>
+    <w:p>
+      <w:pPr>
+        <w:spacing w:before="200"/>
+      </w:pPr>
+      <w:r>
+        <w:rPr>
+          <w:b/>
+          <w:color w:val="1F4E79"/>
+          <w:sz w:val="28"/>
+        </w:rPr>
+        <w:t xml:space="preserve">Paragraph borders (pBdr)</w:t>
+      </w:r>
+    </w:p>
+    <w:p>
+      <w:pPr>
+        <w:pBdr>
+          <w:top w:val="single" w:sz="4"/>
+          <w:left w:val="single" w:sz="4"/>
+          <w:bottom w:val="single" w:sz="4"/>
+          <w:right w:val="single" w:sz="4"/>
+          <w:between w:val="single" w:sz="4"/>
+        </w:pBdr>
+      </w:pPr>
+      <w:r>
+        <w:rPr/>
+        <w:t xml:space="preserve">Box border, all sides (single)</w:t>
+      </w:r>
+    </w:p>
+    <w:p>
+      <w:pPr>
+        <w:pBdr>
+          <w:top w:val="single" w:color="FF0000" w:sz="8"/>
+          <w:left w:val="single" w:color="FF0000" w:sz="8"/>
+          <w:bottom w:val="single" w:color="FF0000" w:sz="8"/>
+          <w:right w:val="single" w:color="FF0000" w:sz="8"/>
+          <w:between w:val="single" w:color="FF0000" w:sz="8"/>
+        </w:pBdr>
+      </w:pPr>
+      <w:r>
+        <w:rPr/>
+        <w:t xml:space="preserve">Red 1pt box (style;size;color)</w:t>
+      </w:r>
+    </w:p>
+    <w:p>
+      <w:pPr>
+        <w:spacing w:before="200"/>
+      </w:pPr>
+      <w:r>
+        <w:rPr>
+          <w:b/>
+          <w:color w:val="1F4E79"/>
+          <w:sz w:val="28"/>
+        </w:rPr>
+        <w:t xml:space="preserve">Vertical text alignment</w:t>
+      </w:r>
+    </w:p>
+    <w:p>
+      <w:pPr>
+        <w:textAlignment xmlns:w="http://schemas.openxmlformats.org/wordprocessingml/2006/main" w:val="center"/>
+      </w:pPr>
+      <w:r>
+        <w:rPr/>
+        <w:t xml:space="preserve">textAlignment=center (glyphs centered on the line box)</w:t>
+      </w:r>
+    </w:p>
+    <w:p>
+      <w:pPr>
+        <w:textAlignment xmlns:w="http://schemas.openxmlformats.org/wordprocessingml/2006/main" w:val="top"/>
+      </w:pPr>
+      <w:r>
+        <w:rPr/>
+        <w:t xml:space="preserve">textAlignment=top</w:t>
+      </w:r>
+    </w:p>
+    <w:p>
+      <w:pPr>
+        <w:spacing w:before="200"/>
+      </w:pPr>
+      <w:r>
+        <w:rPr>
+          <w:b/>
+          <w:color w:val="1F4E79"/>
+          <w:sz w:val="28"/>
+        </w:rPr>
+        <w:t xml:space="preserve">EastAsian typography</w:t>
+      </w:r>
+    </w:p>
+    <w:p>
+      <w:pPr>
+        <w:kinsoku xmlns:w="http://schemas.openxmlformats.org/wordprocessingml/2006/main" w:val="0"/>
+      </w:pPr>
+      <w:r>
+        <w:rPr/>
+        <w:t xml:space="preserve">kinsoku off — permit breaks at forbidden CJK chars</w:t>
+      </w:r>
+    </w:p>
+    <w:p>
+      <w:pPr>
+        <w:autoSpaceDE xmlns:w="http://schemas.openxmlformats.org/wordprocessingml/2006/main" w:val="0"/>
+        <w:autoSpaceDN xmlns:w="http://schemas.openxmlformats.org/wordprocessingml/2006/main" w:val="0"/>
+      </w:pPr>
+      <w:r>
+        <w:rPr/>
+        <w:t xml:space="preserve">autoSpace off — no auto gap between CJK and Latin/digits</w:t>
+      </w:r>
+    </w:p>
+    <w:p>
+      <w:pPr>
+        <w:overflowPunct xmlns:w="http://schemas.openxmlformats.org/wordprocessingml/2006/main" w:val="1"/>
+        <w:topLinePunct xmlns:w="http://schemas.openxmlformats.org/wordprocessingml/2006/main" w:val="1"/>
+      </w:pPr>
+      <w:r>
+        <w:rPr/>
+        <w:t xml:space="preserve">overflowPunct + topLinePunct on</w:t>
+      </w:r>
+    </w:p>
+    <w:p>
+      <w:pPr>
+        <w:spacing w:before="200"/>
+      </w:pPr>
+      <w:r>
+        <w:rPr>
+          <w:b/>
+          <w:color w:val="1F4E79"/>
+          <w:sz w:val="28"/>
+        </w:rPr>
+        <w:t xml:space="preserve">Line &amp; indent flags</w:t>
+      </w:r>
+    </w:p>
+    <w:p>
+      <w:pPr>
+        <w:suppressLineNumbers xmlns:w="http://schemas.openxmlformats.org/wordprocessingml/2006/main" w:val="1"/>
+        <w:suppressAutoHyphens xmlns:w="http://schemas.openxmlformats.org/wordprocessingml/2006/main" w:val="1"/>
+      </w:pPr>
+      <w:r>
+        <w:rPr/>
+        <w:t xml:space="preserve">suppressLineNumbers + suppressAutoHyphens</w:t>
+      </w:r>
+    </w:p>
+    <w:p>
+      <w:pPr>
+        <w:adjustRightInd xmlns:w="http://schemas.openxmlformats.org/wordprocessingml/2006/main" w:val="0"/>
+        <w:snapToGrid xmlns:w="http://schemas.openxmlformats.org/wordprocessingml/2006/main" w:val="0"/>
+        <w:mirrorIndents xmlns:w="http://schemas.openxmlformats.org/wordprocessingml/2006/main" w:val="1"/>
+      </w:pPr>
+      <w:r>
+        <w:rPr/>
+        <w:t xml:space="preserve">mirrorIndents on, adjustRightInd off, snapToGrid off</w:t>
       </w:r>
     </w:p>
     <w:p>

</xml_diff>